<commit_message>
Further done the self assessment doc
</commit_message>
<xml_diff>
--- a/Self_assessment_document.docx
+++ b/Self_assessment_document.docx
@@ -83,7 +83,15 @@
         <w:t>ing</w:t>
       </w:r>
       <w:r>
-        <w:t xml:space="preserve"> a short explanation of</w:t>
+        <w:t xml:space="preserve"> </w:t>
+      </w:r>
+      <w:proofErr w:type="gramStart"/>
+      <w:r>
+        <w:t>a short explanation</w:t>
+      </w:r>
+      <w:proofErr w:type="gramEnd"/>
+      <w:r>
+        <w:t xml:space="preserve"> of</w:t>
       </w:r>
       <w:r>
         <w:t xml:space="preserve"> how you have satisfied the requirement and how it has </w:t>
@@ -738,6 +746,139 @@
                 <w:szCs w:val="20"/>
               </w:rPr>
             </w:pPr>
+            <w:r>
+              <w:rPr>
+                <w:sz w:val="20"/>
+                <w:szCs w:val="20"/>
+              </w:rPr>
+              <w:t>The use of vectors can be seen in simple places like in coursework.cpp from lines 117 to 126 where in input the positions of each teapot using the glm library function vec3</w:t>
+            </w:r>
+            <w:proofErr w:type="gramStart"/>
+            <w:r>
+              <w:rPr>
+                <w:sz w:val="20"/>
+                <w:szCs w:val="20"/>
+              </w:rPr>
+              <w:t xml:space="preserve">.  </w:t>
+            </w:r>
+            <w:proofErr w:type="gramEnd"/>
+            <w:r>
+              <w:rPr>
+                <w:sz w:val="20"/>
+                <w:szCs w:val="20"/>
+              </w:rPr>
+              <w:t xml:space="preserve">There are other examples also for example for the camera in line 23 in coursework.cpp or in lines 144 to 184 for the colour </w:t>
+            </w:r>
+            <w:proofErr w:type="gramStart"/>
+            <w:r>
+              <w:rPr>
+                <w:sz w:val="20"/>
+                <w:szCs w:val="20"/>
+              </w:rPr>
+              <w:t>an</w:t>
+            </w:r>
+            <w:proofErr w:type="gramEnd"/>
+            <w:r>
+              <w:rPr>
+                <w:sz w:val="20"/>
+                <w:szCs w:val="20"/>
+              </w:rPr>
+              <w:t xml:space="preserve"> positions for each light source.</w:t>
+            </w:r>
+          </w:p>
+          <w:p>
+            <w:pPr>
+              <w:rPr>
+                <w:sz w:val="20"/>
+                <w:szCs w:val="20"/>
+              </w:rPr>
+            </w:pPr>
+          </w:p>
+          <w:p>
+            <w:pPr>
+              <w:rPr>
+                <w:sz w:val="20"/>
+                <w:szCs w:val="20"/>
+              </w:rPr>
+            </w:pPr>
+            <w:r>
+              <w:rPr>
+                <w:sz w:val="20"/>
+                <w:szCs w:val="20"/>
+              </w:rPr>
+              <w:t xml:space="preserve">In math.cpp is also an example for the use of vector </w:t>
+            </w:r>
+            <w:proofErr w:type="gramStart"/>
+            <w:r>
+              <w:rPr>
+                <w:sz w:val="20"/>
+                <w:szCs w:val="20"/>
+              </w:rPr>
+              <w:t>an</w:t>
+            </w:r>
+            <w:proofErr w:type="gramEnd"/>
+            <w:r>
+              <w:rPr>
+                <w:sz w:val="20"/>
+                <w:szCs w:val="20"/>
+              </w:rPr>
+              <w:t xml:space="preserve"> matrix objects because of the functions for example the translate function makes use of a translation matrix to translate a set of point vectors. The glm library makes it easier for us as it does all the calculation for us. </w:t>
+            </w:r>
+          </w:p>
+          <w:p>
+            <w:pPr>
+              <w:rPr>
+                <w:sz w:val="20"/>
+                <w:szCs w:val="20"/>
+              </w:rPr>
+            </w:pPr>
+            <w:proofErr w:type="gramStart"/>
+            <w:r>
+              <w:rPr>
+                <w:sz w:val="20"/>
+                <w:szCs w:val="20"/>
+              </w:rPr>
+              <w:t>Also</w:t>
+            </w:r>
+            <w:proofErr w:type="gramEnd"/>
+            <w:r>
+              <w:rPr>
+                <w:sz w:val="20"/>
+                <w:szCs w:val="20"/>
+              </w:rPr>
+              <w:t xml:space="preserve"> just like translate the other functions also make use of vectors and matrices to scale or to rotate the object.</w:t>
+            </w:r>
+          </w:p>
+          <w:p>
+            <w:pPr>
+              <w:rPr>
+                <w:sz w:val="20"/>
+                <w:szCs w:val="20"/>
+              </w:rPr>
+            </w:pPr>
+          </w:p>
+          <w:p>
+            <w:pPr>
+              <w:rPr>
+                <w:sz w:val="20"/>
+                <w:szCs w:val="20"/>
+              </w:rPr>
+            </w:pPr>
+            <w:r>
+              <w:rPr>
+                <w:sz w:val="20"/>
+                <w:szCs w:val="20"/>
+              </w:rPr>
+              <w:t>It is also further proved in other requirements further below.</w:t>
+            </w:r>
+          </w:p>
+          <w:p>
+            <w:pPr>
+              <w:rPr>
+                <w:sz w:val="20"/>
+                <w:szCs w:val="20"/>
+              </w:rPr>
+            </w:pPr>
           </w:p>
         </w:tc>
       </w:tr>
@@ -777,23 +918,7 @@
                 <w:sz w:val="20"/>
                 <w:szCs w:val="20"/>
               </w:rPr>
-              <w:t xml:space="preserve">LO2: Application compiles and runs without alterations to the source code of </w:t>
-            </w:r>
-            <w:proofErr w:type="spellStart"/>
-            <w:r>
-              <w:rPr>
-                <w:sz w:val="20"/>
-                <w:szCs w:val="20"/>
-              </w:rPr>
-              <w:t>CMake</w:t>
-            </w:r>
-            <w:proofErr w:type="spellEnd"/>
-            <w:r>
-              <w:rPr>
-                <w:sz w:val="20"/>
-                <w:szCs w:val="20"/>
-              </w:rPr>
-              <w:t xml:space="preserve"> file. </w:t>
+              <w:t xml:space="preserve">LO2: Application compiles and runs without alterations to the source code of CMake file. </w:t>
             </w:r>
           </w:p>
         </w:tc>
@@ -804,6 +929,9 @@
           </w:tcPr>
           <w:p>
             <w:r>
+              <w:rPr>
+                <w:noProof/>
+              </w:rPr>
               <w:drawing>
                 <wp:inline distT="0" distB="0" distL="0" distR="0" wp14:anchorId="0FE63F77" wp14:editId="57400840">
                   <wp:extent cx="2981795" cy="2338592"/>
@@ -895,6 +1023,215 @@
                 <w:szCs w:val="20"/>
               </w:rPr>
             </w:pPr>
+            <w:r>
+              <w:rPr>
+                <w:sz w:val="20"/>
+                <w:szCs w:val="20"/>
+              </w:rPr>
+              <w:t xml:space="preserve">I have </w:t>
+            </w:r>
+            <w:proofErr w:type="gramStart"/>
+            <w:r>
+              <w:rPr>
+                <w:sz w:val="20"/>
+                <w:szCs w:val="20"/>
+              </w:rPr>
+              <w:t>3</w:t>
+            </w:r>
+            <w:proofErr w:type="gramEnd"/>
+            <w:r>
+              <w:rPr>
+                <w:sz w:val="20"/>
+                <w:szCs w:val="20"/>
+              </w:rPr>
+              <w:t xml:space="preserve"> objects with each having their own texture. The implementation of shaders to apply the appropriate texture to each object I mostly done on the model.cpp and model.hpp and using the fragmentShader and vertexShader.</w:t>
+            </w:r>
+          </w:p>
+          <w:p>
+            <w:pPr>
+              <w:rPr>
+                <w:sz w:val="20"/>
+                <w:szCs w:val="20"/>
+              </w:rPr>
+            </w:pPr>
+            <w:r>
+              <w:rPr>
+                <w:sz w:val="20"/>
+                <w:szCs w:val="20"/>
+              </w:rPr>
+              <w:t xml:space="preserve">The vertexShader deals with the vertex coordinates and OpenGL uses it to calculate the coordinates of the fragment. </w:t>
+            </w:r>
+            <w:r>
+              <w:rPr>
+                <w:sz w:val="20"/>
+                <w:szCs w:val="20"/>
+              </w:rPr>
+              <w:t xml:space="preserve">The vertexShader takes inputs like the </w:t>
+            </w:r>
+            <w:proofErr w:type="gramStart"/>
+            <w:r>
+              <w:rPr>
+                <w:sz w:val="20"/>
+                <w:szCs w:val="20"/>
+              </w:rPr>
+              <w:t>x,y</w:t>
+            </w:r>
+            <w:proofErr w:type="gramEnd"/>
+            <w:r>
+              <w:rPr>
+                <w:sz w:val="20"/>
+                <w:szCs w:val="20"/>
+              </w:rPr>
+              <w:t xml:space="preserve">,z coordinates of the vertices and the </w:t>
+            </w:r>
+            <w:proofErr w:type="gramStart"/>
+            <w:r>
+              <w:rPr>
+                <w:sz w:val="20"/>
+                <w:szCs w:val="20"/>
+              </w:rPr>
+              <w:t>u,v</w:t>
+            </w:r>
+            <w:proofErr w:type="gramEnd"/>
+            <w:r>
+              <w:rPr>
+                <w:sz w:val="20"/>
+                <w:szCs w:val="20"/>
+              </w:rPr>
+              <w:t xml:space="preserve"> coordinates that correspond the triangle vertices.</w:t>
+            </w:r>
+          </w:p>
+          <w:p>
+            <w:pPr>
+              <w:rPr>
+                <w:sz w:val="20"/>
+                <w:szCs w:val="20"/>
+              </w:rPr>
+            </w:pPr>
+          </w:p>
+          <w:p>
+            <w:pPr>
+              <w:rPr>
+                <w:sz w:val="20"/>
+                <w:szCs w:val="20"/>
+              </w:rPr>
+            </w:pPr>
+            <w:r>
+              <w:rPr>
+                <w:sz w:val="20"/>
+                <w:szCs w:val="20"/>
+              </w:rPr>
+              <w:t>The fragmentShader is where we retrieve the colour from the texture</w:t>
+            </w:r>
+            <w:proofErr w:type="gramStart"/>
+            <w:r>
+              <w:rPr>
+                <w:sz w:val="20"/>
+                <w:szCs w:val="20"/>
+              </w:rPr>
+              <w:t xml:space="preserve">.  </w:t>
+            </w:r>
+            <w:proofErr w:type="gramEnd"/>
+            <w:r>
+              <w:rPr>
+                <w:sz w:val="20"/>
+                <w:szCs w:val="20"/>
+              </w:rPr>
+              <w:t>We input the UV that has been outputted from the vertex shader.</w:t>
+            </w:r>
+          </w:p>
+          <w:p>
+            <w:pPr>
+              <w:rPr>
+                <w:sz w:val="20"/>
+                <w:szCs w:val="20"/>
+              </w:rPr>
+            </w:pPr>
+          </w:p>
+          <w:p>
+            <w:pPr>
+              <w:rPr>
+                <w:sz w:val="20"/>
+                <w:szCs w:val="20"/>
+              </w:rPr>
+            </w:pPr>
+            <w:r>
+              <w:rPr>
+                <w:sz w:val="20"/>
+                <w:szCs w:val="20"/>
+              </w:rPr>
+              <w:t xml:space="preserve">In model.cpp we can </w:t>
+            </w:r>
+            <w:proofErr w:type="spellStart"/>
+            <w:r>
+              <w:rPr>
+                <w:sz w:val="20"/>
+                <w:szCs w:val="20"/>
+              </w:rPr>
+              <w:t>se</w:t>
+            </w:r>
+            <w:proofErr w:type="spellEnd"/>
+            <w:r>
+              <w:rPr>
+                <w:sz w:val="20"/>
+                <w:szCs w:val="20"/>
+              </w:rPr>
+              <w:t xml:space="preserve"> from lines 25 to 49 how the objects will be </w:t>
+            </w:r>
+            <w:proofErr w:type="gramStart"/>
+            <w:r>
+              <w:rPr>
+                <w:sz w:val="20"/>
+                <w:szCs w:val="20"/>
+              </w:rPr>
+              <w:t>drawn</w:t>
+            </w:r>
+            <w:proofErr w:type="gramEnd"/>
+            <w:r>
+              <w:rPr>
+                <w:sz w:val="20"/>
+                <w:szCs w:val="20"/>
+              </w:rPr>
+              <w:t xml:space="preserve"> and their textures are bind to them.</w:t>
+            </w:r>
+          </w:p>
+          <w:p>
+            <w:pPr>
+              <w:rPr>
+                <w:sz w:val="20"/>
+                <w:szCs w:val="20"/>
+              </w:rPr>
+            </w:pPr>
+            <w:r>
+              <w:rPr>
+                <w:sz w:val="20"/>
+                <w:szCs w:val="20"/>
+              </w:rPr>
+              <w:t>From lines 51 to 119 a function is made to set up and load the buffers.</w:t>
+            </w:r>
+          </w:p>
+          <w:p>
+            <w:pPr>
+              <w:rPr>
+                <w:sz w:val="20"/>
+                <w:szCs w:val="20"/>
+              </w:rPr>
+            </w:pPr>
+          </w:p>
+          <w:p>
+            <w:pPr>
+              <w:rPr>
+                <w:sz w:val="20"/>
+                <w:szCs w:val="20"/>
+              </w:rPr>
+            </w:pPr>
+            <w:r>
+              <w:rPr>
+                <w:sz w:val="20"/>
+                <w:szCs w:val="20"/>
+              </w:rPr>
+              <w:t>In lines 242 to 248 is the function that is use in the coursework.cpp to add the texture to each object.</w:t>
+            </w:r>
           </w:p>
         </w:tc>
       </w:tr>
@@ -941,7 +1278,23 @@
                 <w:sz w:val="20"/>
                 <w:szCs w:val="20"/>
               </w:rPr>
-              <w:t>LO1: Basic use of translation, rotation and scaling transformations.</w:t>
+              <w:t xml:space="preserve">LO1: Basic use of translation, </w:t>
+            </w:r>
+            <w:proofErr w:type="gramStart"/>
+            <w:r>
+              <w:rPr>
+                <w:sz w:val="20"/>
+                <w:szCs w:val="20"/>
+              </w:rPr>
+              <w:t>rotation</w:t>
+            </w:r>
+            <w:proofErr w:type="gramEnd"/>
+            <w:r>
+              <w:rPr>
+                <w:sz w:val="20"/>
+                <w:szCs w:val="20"/>
+              </w:rPr>
+              <w:t xml:space="preserve"> and scaling transformations.</w:t>
             </w:r>
           </w:p>
         </w:tc>
@@ -962,46 +1315,78 @@
                 <w:sz w:val="20"/>
                 <w:szCs w:val="20"/>
               </w:rPr>
-              <w:t xml:space="preserve">In the math class(maths.cpp) in them I have created functions for translation, rotation and scaling using the </w:t>
-            </w:r>
-            <w:proofErr w:type="spellStart"/>
-            <w:r>
-              <w:rPr>
-                <w:sz w:val="20"/>
-                <w:szCs w:val="20"/>
-              </w:rPr>
-              <w:t>glm</w:t>
-            </w:r>
-            <w:proofErr w:type="spellEnd"/>
-            <w:r>
-              <w:rPr>
-                <w:sz w:val="20"/>
-                <w:szCs w:val="20"/>
-              </w:rPr>
-              <w:t xml:space="preserve"> library(</w:t>
-            </w:r>
-            <w:proofErr w:type="spellStart"/>
-            <w:r>
-              <w:rPr>
-                <w:sz w:val="20"/>
-                <w:szCs w:val="20"/>
-              </w:rPr>
-              <w:t>glm</w:t>
-            </w:r>
-            <w:proofErr w:type="spellEnd"/>
-            <w:r>
-              <w:rPr>
-                <w:sz w:val="20"/>
-                <w:szCs w:val="20"/>
-              </w:rPr>
-              <w:t xml:space="preserve">::mat4), by doing this I can calculate any translation, rotation or scaling matrix for any object in the coursework.cpp file. </w:t>
-            </w:r>
-            <w:r>
-              <w:rPr>
-                <w:sz w:val="20"/>
-                <w:szCs w:val="20"/>
-              </w:rPr>
-              <w:t>For example in coursework.cpp in lines 179-182 I use these functions to give the teapots a position, rotation, scale and angle.</w:t>
+              <w:t xml:space="preserve">In the math class(maths.cpp) in them I have created functions for translation, rotation and scaling using the glm </w:t>
+            </w:r>
+            <w:proofErr w:type="gramStart"/>
+            <w:r>
+              <w:rPr>
+                <w:sz w:val="20"/>
+                <w:szCs w:val="20"/>
+              </w:rPr>
+              <w:t>library(</w:t>
+            </w:r>
+            <w:proofErr w:type="gramEnd"/>
+            <w:r>
+              <w:rPr>
+                <w:sz w:val="20"/>
+                <w:szCs w:val="20"/>
+              </w:rPr>
+              <w:t xml:space="preserve">glm::mat4), by doing this I can calculate any translation, </w:t>
+            </w:r>
+            <w:proofErr w:type="gramStart"/>
+            <w:r>
+              <w:rPr>
+                <w:sz w:val="20"/>
+                <w:szCs w:val="20"/>
+              </w:rPr>
+              <w:t>rotation</w:t>
+            </w:r>
+            <w:proofErr w:type="gramEnd"/>
+            <w:r>
+              <w:rPr>
+                <w:sz w:val="20"/>
+                <w:szCs w:val="20"/>
+              </w:rPr>
+              <w:t xml:space="preserve"> or scaling matrix for any object in the coursework.cpp file. </w:t>
+            </w:r>
+            <w:r>
+              <w:rPr>
+                <w:sz w:val="20"/>
+                <w:szCs w:val="20"/>
+              </w:rPr>
+              <w:t xml:space="preserve">For </w:t>
+            </w:r>
+            <w:proofErr w:type="gramStart"/>
+            <w:r>
+              <w:rPr>
+                <w:sz w:val="20"/>
+                <w:szCs w:val="20"/>
+              </w:rPr>
+              <w:t>example</w:t>
+            </w:r>
+            <w:proofErr w:type="gramEnd"/>
+            <w:r>
+              <w:rPr>
+                <w:sz w:val="20"/>
+                <w:szCs w:val="20"/>
+              </w:rPr>
+              <w:t xml:space="preserve"> in coursework.cpp in lines 179-182 I use these functions to give the teapots a position, rotation, </w:t>
+            </w:r>
+            <w:proofErr w:type="gramStart"/>
+            <w:r>
+              <w:rPr>
+                <w:sz w:val="20"/>
+                <w:szCs w:val="20"/>
+              </w:rPr>
+              <w:t>scale</w:t>
+            </w:r>
+            <w:proofErr w:type="gramEnd"/>
+            <w:r>
+              <w:rPr>
+                <w:sz w:val="20"/>
+                <w:szCs w:val="20"/>
+              </w:rPr>
+              <w:t xml:space="preserve"> and angle.</w:t>
             </w:r>
           </w:p>
           <w:p>
@@ -1057,23 +1442,7 @@
                 <w:sz w:val="20"/>
                 <w:szCs w:val="20"/>
               </w:rPr>
-              <w:t xml:space="preserve">LO1: Implementation of </w:t>
-            </w:r>
-            <w:proofErr w:type="spellStart"/>
-            <w:r>
-              <w:rPr>
-                <w:sz w:val="20"/>
-                <w:szCs w:val="20"/>
-              </w:rPr>
-              <w:t>glm</w:t>
-            </w:r>
-            <w:proofErr w:type="spellEnd"/>
-            <w:r>
-              <w:rPr>
-                <w:sz w:val="20"/>
-                <w:szCs w:val="20"/>
-              </w:rPr>
-              <w:t xml:space="preserve"> library functions for calculating view and projection matrices.</w:t>
+              <w:t>LO1: Implementation of glm library functions for calculating view and projection matrices.</w:t>
             </w:r>
           </w:p>
         </w:tc>
@@ -1108,71 +1477,7 @@
                 <w:sz w:val="20"/>
                 <w:szCs w:val="20"/>
               </w:rPr>
-              <w:t xml:space="preserve"> use of the </w:t>
-            </w:r>
-            <w:proofErr w:type="spellStart"/>
-            <w:r>
-              <w:rPr>
-                <w:sz w:val="20"/>
-                <w:szCs w:val="20"/>
-              </w:rPr>
-              <w:t>lookat</w:t>
-            </w:r>
-            <w:proofErr w:type="spellEnd"/>
-            <w:r>
-              <w:rPr>
-                <w:sz w:val="20"/>
-                <w:szCs w:val="20"/>
-              </w:rPr>
-              <w:t xml:space="preserve"> and perspective function from the </w:t>
-            </w:r>
-            <w:proofErr w:type="spellStart"/>
-            <w:r>
-              <w:rPr>
-                <w:sz w:val="20"/>
-                <w:szCs w:val="20"/>
-              </w:rPr>
-              <w:t>glm</w:t>
-            </w:r>
-            <w:proofErr w:type="spellEnd"/>
-            <w:r>
-              <w:rPr>
-                <w:sz w:val="20"/>
-                <w:szCs w:val="20"/>
-              </w:rPr>
-              <w:t xml:space="preserve"> library. In camera.cpp on line 15 I use the </w:t>
-            </w:r>
-            <w:proofErr w:type="spellStart"/>
-            <w:r>
-              <w:rPr>
-                <w:sz w:val="20"/>
-                <w:szCs w:val="20"/>
-              </w:rPr>
-              <w:t>lookat</w:t>
-            </w:r>
-            <w:proofErr w:type="spellEnd"/>
-            <w:r>
-              <w:rPr>
-                <w:sz w:val="20"/>
-                <w:szCs w:val="20"/>
-              </w:rPr>
-              <w:t xml:space="preserve"> function to calculate the view matrix, this gets given the inputs of the eye which are the coordinates for the camera position, the inputs for target which are the coordinates of the target point the camera is pointing at and the input of </w:t>
-            </w:r>
-            <w:proofErr w:type="spellStart"/>
-            <w:r>
-              <w:rPr>
-                <w:sz w:val="20"/>
-                <w:szCs w:val="20"/>
-              </w:rPr>
-              <w:t>worldUp</w:t>
-            </w:r>
-            <w:proofErr w:type="spellEnd"/>
-            <w:r>
-              <w:rPr>
-                <w:sz w:val="20"/>
-                <w:szCs w:val="20"/>
-              </w:rPr>
-              <w:t xml:space="preserve"> which is a vector pointing straight up</w:t>
+              <w:t xml:space="preserve"> use of the lookat and perspective function from the glm library. In camera.cpp on line 15 I use the lookat function to calculate the view matrix, this gets given the inputs of the eye which are the coordinates for the camera position, the inputs for target which are the coordinates of the target point the camera is pointing at and the input of worldUp which is a vector pointing straight up</w:t>
             </w:r>
             <w:r>
               <w:rPr>
@@ -1204,15 +1509,13 @@
               </w:rPr>
               <w:t xml:space="preserve">Then on line 18 I use the perspective function to calculate the </w:t>
             </w:r>
-            <w:proofErr w:type="spellStart"/>
-            <w:r>
-              <w:rPr>
-                <w:sz w:val="20"/>
-                <w:szCs w:val="20"/>
-              </w:rPr>
-              <w:t>perpective</w:t>
-            </w:r>
-            <w:proofErr w:type="spellEnd"/>
+            <w:r>
+              <w:rPr>
+                <w:sz w:val="20"/>
+                <w:szCs w:val="20"/>
+              </w:rPr>
+              <w:t>perspective</w:t>
+            </w:r>
             <w:r>
               <w:rPr>
                 <w:sz w:val="20"/>
@@ -1258,21 +1561,12 @@
                 <w:szCs w:val="20"/>
               </w:rPr>
             </w:pPr>
-            <w:proofErr w:type="spellStart"/>
-            <w:r>
-              <w:rPr>
-                <w:sz w:val="20"/>
-                <w:szCs w:val="20"/>
-              </w:rPr>
-              <w:t>fov</w:t>
-            </w:r>
-            <w:proofErr w:type="spellEnd"/>
-            <w:r>
-              <w:rPr>
-                <w:sz w:val="20"/>
-                <w:szCs w:val="20"/>
-              </w:rPr>
-              <w:t xml:space="preserve"> – field of view angle </w:t>
+            <w:r>
+              <w:rPr>
+                <w:sz w:val="20"/>
+                <w:szCs w:val="20"/>
+              </w:rPr>
+              <w:t xml:space="preserve">fov – field of view angle </w:t>
             </w:r>
             <w:r>
               <w:rPr>
@@ -1392,23 +1686,7 @@
                 <w:sz w:val="20"/>
                 <w:szCs w:val="20"/>
               </w:rPr>
-              <w:t>loads the vertex and texture coordinates from an .</w:t>
-            </w:r>
-            <w:proofErr w:type="spellStart"/>
-            <w:r>
-              <w:rPr>
-                <w:sz w:val="20"/>
-                <w:szCs w:val="20"/>
-              </w:rPr>
-              <w:t>obj</w:t>
-            </w:r>
-            <w:proofErr w:type="spellEnd"/>
-            <w:r>
-              <w:rPr>
-                <w:sz w:val="20"/>
-                <w:szCs w:val="20"/>
-              </w:rPr>
-              <w:t xml:space="preserve"> file and creates the relevant buffers</w:t>
+              <w:t>loads the vertex and texture coordinates from an .obj file and creates the relevant buffers</w:t>
             </w:r>
             <w:r>
               <w:rPr>
@@ -1422,7 +1700,23 @@
                 <w:sz w:val="20"/>
                 <w:szCs w:val="20"/>
               </w:rPr>
-              <w:t>I then proceeded to add the teapots to the objects vector and assign their positions by making an array, the rotation, scale and angle for all of them</w:t>
+              <w:t xml:space="preserve">I then proceeded to add the teapots to the objects vector and assign their positions by making an array, the rotation, </w:t>
+            </w:r>
+            <w:proofErr w:type="gramStart"/>
+            <w:r>
+              <w:rPr>
+                <w:sz w:val="20"/>
+                <w:szCs w:val="20"/>
+              </w:rPr>
+              <w:t>scale</w:t>
+            </w:r>
+            <w:proofErr w:type="gramEnd"/>
+            <w:r>
+              <w:rPr>
+                <w:sz w:val="20"/>
+                <w:szCs w:val="20"/>
+              </w:rPr>
+              <w:t xml:space="preserve"> and angle for all of them</w:t>
             </w:r>
             <w:r>
               <w:rPr>
@@ -1491,14 +1785,46 @@
                 <w:sz w:val="20"/>
                 <w:szCs w:val="20"/>
               </w:rPr>
-              <w:t>In coursework.cpp from lines 144 to 175 you can see that I have added many point light sources</w:t>
-            </w:r>
-            <w:r>
-              <w:rPr>
-                <w:sz w:val="20"/>
-                <w:szCs w:val="20"/>
-              </w:rPr>
-              <w:t xml:space="preserve">, each of them with their position, colour  and attenuation. </w:t>
+              <w:t xml:space="preserve">In coursework.cpp from lines 144 to 175 you can see that I have added </w:t>
+            </w:r>
+            <w:proofErr w:type="gramStart"/>
+            <w:r>
+              <w:rPr>
+                <w:sz w:val="20"/>
+                <w:szCs w:val="20"/>
+              </w:rPr>
+              <w:t>many</w:t>
+            </w:r>
+            <w:proofErr w:type="gramEnd"/>
+            <w:r>
+              <w:rPr>
+                <w:sz w:val="20"/>
+                <w:szCs w:val="20"/>
+              </w:rPr>
+              <w:t xml:space="preserve"> point light sources</w:t>
+            </w:r>
+            <w:r>
+              <w:rPr>
+                <w:sz w:val="20"/>
+                <w:szCs w:val="20"/>
+              </w:rPr>
+              <w:t xml:space="preserve">, each of them with their position, </w:t>
+            </w:r>
+            <w:proofErr w:type="gramStart"/>
+            <w:r>
+              <w:rPr>
+                <w:sz w:val="20"/>
+                <w:szCs w:val="20"/>
+              </w:rPr>
+              <w:t>colour  and</w:t>
+            </w:r>
+            <w:proofErr w:type="gramEnd"/>
+            <w:r>
+              <w:rPr>
+                <w:sz w:val="20"/>
+                <w:szCs w:val="20"/>
+              </w:rPr>
+              <w:t xml:space="preserve"> attenuation. </w:t>
             </w:r>
             <w:r>
               <w:rPr>
@@ -1567,106 +1893,186 @@
                 <w:szCs w:val="20"/>
               </w:rPr>
             </w:pPr>
-            <w:proofErr w:type="spellStart"/>
-            <w:r>
-              <w:rPr>
-                <w:sz w:val="20"/>
-                <w:szCs w:val="20"/>
-              </w:rPr>
-              <w:t>kd</w:t>
-            </w:r>
-            <w:proofErr w:type="spellEnd"/>
-            <w:r>
-              <w:rPr>
-                <w:sz w:val="20"/>
-                <w:szCs w:val="20"/>
-              </w:rPr>
-              <w:t xml:space="preserve"> – that is diffuse reflection which reflects light of a rough surface</w:t>
-            </w:r>
-          </w:p>
-          <w:p>
-            <w:pPr>
-              <w:rPr>
-                <w:sz w:val="20"/>
-                <w:szCs w:val="20"/>
-              </w:rPr>
-            </w:pPr>
-            <w:proofErr w:type="spellStart"/>
-            <w:r>
-              <w:rPr>
-                <w:sz w:val="20"/>
-                <w:szCs w:val="20"/>
-              </w:rPr>
-              <w:t>ks</w:t>
-            </w:r>
-            <w:proofErr w:type="spellEnd"/>
-            <w:r>
-              <w:rPr>
-                <w:sz w:val="20"/>
-                <w:szCs w:val="20"/>
-              </w:rPr>
-              <w:t xml:space="preserve"> and Ns – Specular reflection which depends on the position of the light source.</w:t>
-            </w:r>
-          </w:p>
-          <w:p>
-            <w:pPr>
-              <w:rPr>
-                <w:sz w:val="20"/>
-                <w:szCs w:val="20"/>
-              </w:rPr>
-            </w:pPr>
-          </w:p>
-          <w:p>
-            <w:pPr>
-              <w:rPr>
-                <w:sz w:val="20"/>
-                <w:szCs w:val="20"/>
-              </w:rPr>
-            </w:pPr>
-            <w:r>
-              <w:rPr>
-                <w:sz w:val="20"/>
-                <w:szCs w:val="20"/>
-              </w:rPr>
-              <w:t>The sum of these 3 properties gives the colour intensity of a fragment on a surface.</w:t>
-            </w:r>
-          </w:p>
-          <w:p>
-            <w:pPr>
-              <w:rPr>
-                <w:sz w:val="20"/>
-                <w:szCs w:val="20"/>
-              </w:rPr>
-            </w:pPr>
-            <w:r>
-              <w:rPr>
-                <w:sz w:val="20"/>
-                <w:szCs w:val="20"/>
-              </w:rPr>
-              <w:t>This is also the reason why the teapot have many textures because each of them reflects the light in a certain way.</w:t>
-            </w:r>
-          </w:p>
-          <w:p>
-            <w:pPr>
-              <w:rPr>
-                <w:sz w:val="20"/>
-                <w:szCs w:val="20"/>
-              </w:rPr>
-            </w:pPr>
-          </w:p>
-          <w:p>
-            <w:pPr>
-              <w:rPr>
-                <w:sz w:val="20"/>
-                <w:szCs w:val="20"/>
-              </w:rPr>
-            </w:pPr>
-            <w:r>
-              <w:rPr>
-                <w:sz w:val="20"/>
-                <w:szCs w:val="20"/>
-              </w:rPr>
-              <w:t xml:space="preserve">All of this lighting calculation are done by the shaders in the fragments shader </w:t>
+            <w:r>
+              <w:rPr>
+                <w:sz w:val="20"/>
+                <w:szCs w:val="20"/>
+              </w:rPr>
+              <w:t xml:space="preserve">kd – that is diffuse reflection which reflects light of a rough </w:t>
+            </w:r>
+            <w:proofErr w:type="gramStart"/>
+            <w:r>
+              <w:rPr>
+                <w:sz w:val="20"/>
+                <w:szCs w:val="20"/>
+              </w:rPr>
+              <w:t>surface</w:t>
+            </w:r>
+            <w:proofErr w:type="gramEnd"/>
+          </w:p>
+          <w:p>
+            <w:pPr>
+              <w:rPr>
+                <w:sz w:val="20"/>
+                <w:szCs w:val="20"/>
+              </w:rPr>
+            </w:pPr>
+            <w:r>
+              <w:rPr>
+                <w:sz w:val="20"/>
+                <w:szCs w:val="20"/>
+              </w:rPr>
+              <w:t>ks and Ns – Specular reflection which depends on the position of the light source.</w:t>
+            </w:r>
+          </w:p>
+          <w:p>
+            <w:pPr>
+              <w:rPr>
+                <w:sz w:val="20"/>
+                <w:szCs w:val="20"/>
+              </w:rPr>
+            </w:pPr>
+          </w:p>
+          <w:p>
+            <w:pPr>
+              <w:rPr>
+                <w:sz w:val="20"/>
+                <w:szCs w:val="20"/>
+              </w:rPr>
+            </w:pPr>
+            <w:r>
+              <w:rPr>
+                <w:sz w:val="20"/>
+                <w:szCs w:val="20"/>
+              </w:rPr>
+              <w:t xml:space="preserve">The sum of these </w:t>
+            </w:r>
+            <w:proofErr w:type="gramStart"/>
+            <w:r>
+              <w:rPr>
+                <w:sz w:val="20"/>
+                <w:szCs w:val="20"/>
+              </w:rPr>
+              <w:t>3</w:t>
+            </w:r>
+            <w:proofErr w:type="gramEnd"/>
+            <w:r>
+              <w:rPr>
+                <w:sz w:val="20"/>
+                <w:szCs w:val="20"/>
+              </w:rPr>
+              <w:t xml:space="preserve"> properties gives the colour intensity of a fragment on a surface.</w:t>
+            </w:r>
+          </w:p>
+          <w:p>
+            <w:pPr>
+              <w:rPr>
+                <w:sz w:val="20"/>
+                <w:szCs w:val="20"/>
+              </w:rPr>
+            </w:pPr>
+            <w:r>
+              <w:rPr>
+                <w:sz w:val="20"/>
+                <w:szCs w:val="20"/>
+              </w:rPr>
+              <w:t xml:space="preserve">This is also the </w:t>
+            </w:r>
+            <w:proofErr w:type="gramStart"/>
+            <w:r>
+              <w:rPr>
+                <w:sz w:val="20"/>
+                <w:szCs w:val="20"/>
+              </w:rPr>
+              <w:t>reason why</w:t>
+            </w:r>
+            <w:proofErr w:type="gramEnd"/>
+            <w:r>
+              <w:rPr>
+                <w:sz w:val="20"/>
+                <w:szCs w:val="20"/>
+              </w:rPr>
+              <w:t xml:space="preserve"> the teapot </w:t>
+            </w:r>
+            <w:proofErr w:type="gramStart"/>
+            <w:r>
+              <w:rPr>
+                <w:sz w:val="20"/>
+                <w:szCs w:val="20"/>
+              </w:rPr>
+              <w:t>have</w:t>
+            </w:r>
+            <w:proofErr w:type="gramEnd"/>
+            <w:r>
+              <w:rPr>
+                <w:sz w:val="20"/>
+                <w:szCs w:val="20"/>
+              </w:rPr>
+              <w:t xml:space="preserve"> </w:t>
+            </w:r>
+            <w:proofErr w:type="gramStart"/>
+            <w:r>
+              <w:rPr>
+                <w:sz w:val="20"/>
+                <w:szCs w:val="20"/>
+              </w:rPr>
+              <w:t>many</w:t>
+            </w:r>
+            <w:proofErr w:type="gramEnd"/>
+            <w:r>
+              <w:rPr>
+                <w:sz w:val="20"/>
+                <w:szCs w:val="20"/>
+              </w:rPr>
+              <w:t xml:space="preserve"> textures because each of them reflects the light in a certain way.</w:t>
+            </w:r>
+          </w:p>
+          <w:p>
+            <w:pPr>
+              <w:rPr>
+                <w:sz w:val="20"/>
+                <w:szCs w:val="20"/>
+              </w:rPr>
+            </w:pPr>
+          </w:p>
+          <w:p>
+            <w:pPr>
+              <w:rPr>
+                <w:sz w:val="20"/>
+                <w:szCs w:val="20"/>
+              </w:rPr>
+            </w:pPr>
+            <w:proofErr w:type="gramStart"/>
+            <w:r>
+              <w:rPr>
+                <w:sz w:val="20"/>
+                <w:szCs w:val="20"/>
+              </w:rPr>
+              <w:t>All of</w:t>
+            </w:r>
+            <w:proofErr w:type="gramEnd"/>
+            <w:r>
+              <w:rPr>
+                <w:sz w:val="20"/>
+                <w:szCs w:val="20"/>
+              </w:rPr>
+              <w:t xml:space="preserve"> this lighting calculation are done by the shaders in the </w:t>
+            </w:r>
+            <w:proofErr w:type="gramStart"/>
+            <w:r>
+              <w:rPr>
+                <w:sz w:val="20"/>
+                <w:szCs w:val="20"/>
+              </w:rPr>
+              <w:t>fragments</w:t>
+            </w:r>
+            <w:proofErr w:type="gramEnd"/>
+            <w:r>
+              <w:rPr>
+                <w:sz w:val="20"/>
+                <w:szCs w:val="20"/>
+              </w:rPr>
+              <w:t xml:space="preserve"> shader </w:t>
             </w:r>
             <w:r>
               <w:rPr>
@@ -1915,7 +2321,23 @@
                 <w:sz w:val="20"/>
                 <w:szCs w:val="20"/>
               </w:rPr>
-              <w:t>LO3: Use of shaders to apply dynamic lighting from different types of light sources.</w:t>
+              <w:t xml:space="preserve">LO3: Use of shaders to apply dynamic lighting from </w:t>
+            </w:r>
+            <w:proofErr w:type="gramStart"/>
+            <w:r>
+              <w:rPr>
+                <w:sz w:val="20"/>
+                <w:szCs w:val="20"/>
+              </w:rPr>
+              <w:t>different types</w:t>
+            </w:r>
+            <w:proofErr w:type="gramEnd"/>
+            <w:r>
+              <w:rPr>
+                <w:sz w:val="20"/>
+                <w:szCs w:val="20"/>
+              </w:rPr>
+              <w:t xml:space="preserve"> of light sources.</w:t>
             </w:r>
           </w:p>
         </w:tc>
@@ -1978,71 +2400,71 @@
                 <w:sz w:val="20"/>
                 <w:szCs w:val="20"/>
               </w:rPr>
-              <w:t xml:space="preserve">LO1: Implementation of students own functions to replace </w:t>
-            </w:r>
-            <w:proofErr w:type="spellStart"/>
-            <w:r>
-              <w:rPr>
-                <w:sz w:val="20"/>
-                <w:szCs w:val="20"/>
-              </w:rPr>
-              <w:t>glm</w:t>
-            </w:r>
-            <w:proofErr w:type="spellEnd"/>
-            <w:r>
-              <w:rPr>
-                <w:sz w:val="20"/>
-                <w:szCs w:val="20"/>
-              </w:rPr>
-              <w:t xml:space="preserve"> functions (e.g., </w:t>
-            </w:r>
-            <w:proofErr w:type="spellStart"/>
-            <w:r>
-              <w:rPr>
-                <w:sz w:val="20"/>
-                <w:szCs w:val="20"/>
-              </w:rPr>
-              <w:t>glm</w:t>
-            </w:r>
-            <w:proofErr w:type="spellEnd"/>
-            <w:r>
-              <w:rPr>
-                <w:sz w:val="20"/>
-                <w:szCs w:val="20"/>
-              </w:rPr>
-              <w:t xml:space="preserve">::length(), </w:t>
-            </w:r>
-            <w:proofErr w:type="spellStart"/>
-            <w:r>
-              <w:rPr>
-                <w:sz w:val="20"/>
-                <w:szCs w:val="20"/>
-              </w:rPr>
-              <w:t>glm</w:t>
-            </w:r>
-            <w:proofErr w:type="spellEnd"/>
-            <w:r>
-              <w:rPr>
-                <w:sz w:val="20"/>
-                <w:szCs w:val="20"/>
-              </w:rPr>
-              <w:t xml:space="preserve">::dot(), </w:t>
-            </w:r>
-            <w:proofErr w:type="spellStart"/>
-            <w:r>
-              <w:rPr>
-                <w:sz w:val="20"/>
-                <w:szCs w:val="20"/>
-              </w:rPr>
-              <w:t>glm</w:t>
-            </w:r>
-            <w:proofErr w:type="spellEnd"/>
-            <w:r>
-              <w:rPr>
-                <w:sz w:val="20"/>
-                <w:szCs w:val="20"/>
-              </w:rPr>
-              <w:t>::cross() etc.).</w:t>
+              <w:t>LO1: Implementation of students own functions to replace glm functions (e.g., glm::</w:t>
+            </w:r>
+            <w:proofErr w:type="gramStart"/>
+            <w:r>
+              <w:rPr>
+                <w:sz w:val="20"/>
+                <w:szCs w:val="20"/>
+              </w:rPr>
+              <w:t>length(</w:t>
+            </w:r>
+            <w:proofErr w:type="gramEnd"/>
+            <w:r>
+              <w:rPr>
+                <w:sz w:val="20"/>
+                <w:szCs w:val="20"/>
+              </w:rPr>
+              <w:t>), glm::</w:t>
+            </w:r>
+            <w:proofErr w:type="gramStart"/>
+            <w:r>
+              <w:rPr>
+                <w:sz w:val="20"/>
+                <w:szCs w:val="20"/>
+              </w:rPr>
+              <w:t>dot(</w:t>
+            </w:r>
+            <w:proofErr w:type="gramEnd"/>
+            <w:r>
+              <w:rPr>
+                <w:sz w:val="20"/>
+                <w:szCs w:val="20"/>
+              </w:rPr>
+              <w:t>), glm::</w:t>
+            </w:r>
+            <w:proofErr w:type="gramStart"/>
+            <w:r>
+              <w:rPr>
+                <w:sz w:val="20"/>
+                <w:szCs w:val="20"/>
+              </w:rPr>
+              <w:t>cross(</w:t>
+            </w:r>
+            <w:proofErr w:type="gramEnd"/>
+            <w:r>
+              <w:rPr>
+                <w:sz w:val="20"/>
+                <w:szCs w:val="20"/>
+              </w:rPr>
+              <w:t xml:space="preserve">) </w:t>
+            </w:r>
+            <w:proofErr w:type="gramStart"/>
+            <w:r>
+              <w:rPr>
+                <w:sz w:val="20"/>
+                <w:szCs w:val="20"/>
+              </w:rPr>
+              <w:t>etc.</w:t>
+            </w:r>
+            <w:proofErr w:type="gramEnd"/>
+            <w:r>
+              <w:rPr>
+                <w:sz w:val="20"/>
+                <w:szCs w:val="20"/>
+              </w:rPr>
+              <w:t>).</w:t>
             </w:r>
           </w:p>
         </w:tc>
@@ -2152,7 +2574,39 @@
                 <w:sz w:val="20"/>
                 <w:szCs w:val="20"/>
               </w:rPr>
-              <w:t>LO2: Interactive dynamic aspects of the virtual word and controllable by the user (e.g., position of objects, location and function of light sources etc.).</w:t>
+              <w:t xml:space="preserve">LO2: Interactive dynamic aspects of the virtual word and controllable by the user (e.g., position of objects, </w:t>
+            </w:r>
+            <w:proofErr w:type="gramStart"/>
+            <w:r>
+              <w:rPr>
+                <w:sz w:val="20"/>
+                <w:szCs w:val="20"/>
+              </w:rPr>
+              <w:t>location</w:t>
+            </w:r>
+            <w:proofErr w:type="gramEnd"/>
+            <w:r>
+              <w:rPr>
+                <w:sz w:val="20"/>
+                <w:szCs w:val="20"/>
+              </w:rPr>
+              <w:t xml:space="preserve"> and function of light sources </w:t>
+            </w:r>
+            <w:proofErr w:type="gramStart"/>
+            <w:r>
+              <w:rPr>
+                <w:sz w:val="20"/>
+                <w:szCs w:val="20"/>
+              </w:rPr>
+              <w:t>etc.</w:t>
+            </w:r>
+            <w:proofErr w:type="gramEnd"/>
+            <w:r>
+              <w:rPr>
+                <w:sz w:val="20"/>
+                <w:szCs w:val="20"/>
+              </w:rPr>
+              <w:t>).</w:t>
             </w:r>
           </w:p>
         </w:tc>
@@ -2434,7 +2888,55 @@
                 <w:sz w:val="20"/>
                 <w:szCs w:val="20"/>
               </w:rPr>
-              <w:t>LO2: The position of the camera or character obeys the constraints of the physical space (e.g., can’t pass through objects, can’t hover in midair etc.).</w:t>
+              <w:t xml:space="preserve">LO2: The position of the camera or character obeys the constraints of the physical space (e.g., </w:t>
+            </w:r>
+            <w:proofErr w:type="gramStart"/>
+            <w:r>
+              <w:rPr>
+                <w:sz w:val="20"/>
+                <w:szCs w:val="20"/>
+              </w:rPr>
+              <w:t>can’t</w:t>
+            </w:r>
+            <w:proofErr w:type="gramEnd"/>
+            <w:r>
+              <w:rPr>
+                <w:sz w:val="20"/>
+                <w:szCs w:val="20"/>
+              </w:rPr>
+              <w:t xml:space="preserve"> pass through objects, </w:t>
+            </w:r>
+            <w:proofErr w:type="gramStart"/>
+            <w:r>
+              <w:rPr>
+                <w:sz w:val="20"/>
+                <w:szCs w:val="20"/>
+              </w:rPr>
+              <w:t>can’t</w:t>
+            </w:r>
+            <w:proofErr w:type="gramEnd"/>
+            <w:r>
+              <w:rPr>
+                <w:sz w:val="20"/>
+                <w:szCs w:val="20"/>
+              </w:rPr>
+              <w:t xml:space="preserve"> hover in midair </w:t>
+            </w:r>
+            <w:proofErr w:type="gramStart"/>
+            <w:r>
+              <w:rPr>
+                <w:sz w:val="20"/>
+                <w:szCs w:val="20"/>
+              </w:rPr>
+              <w:t>etc.</w:t>
+            </w:r>
+            <w:proofErr w:type="gramEnd"/>
+            <w:r>
+              <w:rPr>
+                <w:sz w:val="20"/>
+                <w:szCs w:val="20"/>
+              </w:rPr>
+              <w:t>).</w:t>
             </w:r>
           </w:p>
         </w:tc>
@@ -3029,6 +3531,7 @@
   <w:style w:type="character" w:default="1" w:styleId="DefaultParagraphFont">
     <w:name w:val="Default Paragraph Font"/>
     <w:uiPriority w:val="1"/>
+    <w:semiHidden/>
     <w:unhideWhenUsed/>
   </w:style>
   <w:style w:type="table" w:default="1" w:styleId="TableNormal">

</xml_diff>